<commit_message>
chore: embed new Jira Scrum Board, Backlog, and ArgoCD environments screenshots into project docs and slides
</commit_message>
<xml_diff>
--- a/Jeevan C_DevOps Capstone Project.docx
+++ b/Jeevan C_DevOps Capstone Project.docx
@@ -249,6 +249,108 @@
           <w:sz w:val="20"/>
         </w:rPr>
         <w:t>A Scrum-based Jira project manages the full DevOps delivery lifecycle with Epics, Stories, Tasks, and Sub-tasks covering all implementation phases. The board provides real-time sprint visibility.</w:t>
+      </w:r>
+    </w:p>
+    <w:p>
+      <w:pPr>
+        <w:jc w:val="center"/>
+      </w:pPr>
+      <w:r>
+        <w:drawing>
+          <wp:inline xmlns:a="http://schemas.openxmlformats.org/drawingml/2006/main" xmlns:pic="http://schemas.openxmlformats.org/drawingml/2006/picture">
+            <wp:extent cx="4572000" cy="2445774"/>
+            <wp:docPr id="11" name="Picture 11"/>
+            <wp:cNvGraphicFramePr>
+              <a:graphicFrameLocks noChangeAspect="1"/>
+            </wp:cNvGraphicFramePr>
+            <a:graphic>
+              <a:graphicData uri="http://schemas.openxmlformats.org/drawingml/2006/picture">
+                <pic:pic>
+                  <pic:nvPicPr>
+                    <pic:cNvPr id="0" name="board.png"/>
+                    <pic:cNvPicPr/>
+                  </pic:nvPicPr>
+                  <pic:blipFill>
+                    <a:blip r:embed="rId18"/>
+                    <a:stretch>
+                      <a:fillRect/>
+                    </a:stretch>
+                  </pic:blipFill>
+                  <pic:spPr>
+                    <a:xfrm>
+                      <a:off x="0" y="0"/>
+                      <a:ext cx="4572000" cy="2445774"/>
+                    </a:xfrm>
+                    <a:prstGeom prst="rect"/>
+                  </pic:spPr>
+                </pic:pic>
+              </a:graphicData>
+            </a:graphic>
+          </wp:inline>
+        </w:drawing>
+      </w:r>
+    </w:p>
+    <w:p>
+      <w:pPr>
+        <w:jc w:val="center"/>
+      </w:pPr>
+      <w:r>
+        <w:rPr>
+          <w:i/>
+          <w:sz w:val="20"/>
+        </w:rPr>
+        <w:t>Jira Active Scrum Board showing Sprint progress</w:t>
+      </w:r>
+    </w:p>
+    <w:p>
+      <w:pPr>
+        <w:jc w:val="center"/>
+      </w:pPr>
+      <w:r>
+        <w:drawing>
+          <wp:inline xmlns:a="http://schemas.openxmlformats.org/drawingml/2006/main" xmlns:pic="http://schemas.openxmlformats.org/drawingml/2006/picture">
+            <wp:extent cx="4572000" cy="2450649"/>
+            <wp:docPr id="12" name="Picture 12"/>
+            <wp:cNvGraphicFramePr>
+              <a:graphicFrameLocks noChangeAspect="1"/>
+            </wp:cNvGraphicFramePr>
+            <a:graphic>
+              <a:graphicData uri="http://schemas.openxmlformats.org/drawingml/2006/picture">
+                <pic:pic>
+                  <pic:nvPicPr>
+                    <pic:cNvPr id="0" name="Backlog.png"/>
+                    <pic:cNvPicPr/>
+                  </pic:nvPicPr>
+                  <pic:blipFill>
+                    <a:blip r:embed="rId19"/>
+                    <a:stretch>
+                      <a:fillRect/>
+                    </a:stretch>
+                  </pic:blipFill>
+                  <pic:spPr>
+                    <a:xfrm>
+                      <a:off x="0" y="0"/>
+                      <a:ext cx="4572000" cy="2450649"/>
+                    </a:xfrm>
+                    <a:prstGeom prst="rect"/>
+                  </pic:spPr>
+                </pic:pic>
+              </a:graphicData>
+            </a:graphic>
+          </wp:inline>
+        </w:drawing>
+      </w:r>
+    </w:p>
+    <w:p>
+      <w:pPr>
+        <w:jc w:val="center"/>
+      </w:pPr>
+      <w:r>
+        <w:rPr>
+          <w:i/>
+          <w:sz w:val="20"/>
+        </w:rPr>
+        <w:t>Jira Backlog showing nested Epics, User Stories, and Tasks</w:t>
       </w:r>
     </w:p>
     <w:p>
@@ -1112,6 +1214,57 @@
             </a:graphic>
           </wp:inline>
         </w:drawing>
+      </w:r>
+    </w:p>
+    <w:p>
+      <w:pPr>
+        <w:jc w:val="center"/>
+      </w:pPr>
+      <w:r>
+        <w:drawing>
+          <wp:inline xmlns:a="http://schemas.openxmlformats.org/drawingml/2006/main" xmlns:pic="http://schemas.openxmlformats.org/drawingml/2006/picture">
+            <wp:extent cx="4572000" cy="3195851"/>
+            <wp:docPr id="13" name="Picture 13"/>
+            <wp:cNvGraphicFramePr>
+              <a:graphicFrameLocks noChangeAspect="1"/>
+            </wp:cNvGraphicFramePr>
+            <a:graphic>
+              <a:graphicData uri="http://schemas.openxmlformats.org/drawingml/2006/picture">
+                <pic:pic>
+                  <pic:nvPicPr>
+                    <pic:cNvPr id="0" name="Environements.png"/>
+                    <pic:cNvPicPr/>
+                  </pic:nvPicPr>
+                  <pic:blipFill>
+                    <a:blip r:embed="rId20"/>
+                    <a:stretch>
+                      <a:fillRect/>
+                    </a:stretch>
+                  </pic:blipFill>
+                  <pic:spPr>
+                    <a:xfrm>
+                      <a:off x="0" y="0"/>
+                      <a:ext cx="4572000" cy="3195851"/>
+                    </a:xfrm>
+                    <a:prstGeom prst="rect"/>
+                  </pic:spPr>
+                </pic:pic>
+              </a:graphicData>
+            </a:graphic>
+          </wp:inline>
+        </w:drawing>
+      </w:r>
+    </w:p>
+    <w:p>
+      <w:pPr>
+        <w:jc w:val="center"/>
+      </w:pPr>
+      <w:r>
+        <w:rPr>
+          <w:i/>
+          <w:sz w:val="20"/>
+        </w:rPr>
+        <w:t>ArgoCD multi-environment health and sync overview</w:t>
       </w:r>
     </w:p>
     <w:p>

</xml_diff>